<commit_message>
docs(portal): HDSD gia theo Bang gia cua khach va thoi gian giao hang, kem anh chup man hinh
md2docx.py nhung duoc anh ![chu thich](duong-dan); hai HDSD cu them ghi chu
tro sang tai lieu moi o cac doan da loi thoi.

Co-Authored-By: Claude Opus 5.5 <noreply@anthropic.com>
</commit_message>
<xml_diff>
--- a/docs/HDSD-phan-quyen-khoa-phong.docx
+++ b/docs/HDSD-phan-quyen-khoa-phong.docx
@@ -40,7 +40,7 @@
           <w:b/>
           <w:i w:val="0"/>
         </w:rPr>
-        <w:t>26/08/2026</w:t>
+        <w:t>03/09/2026</w:t>
       </w:r>
       <w:r>
         <w:rPr>
@@ -51,19 +51,22 @@
       </w:r>
     </w:p>
     <w:p>
+      <w:pPr>
+        <w:pStyle w:val="IntenseQuote"/>
+      </w:pPr>
       <w:r>
         <w:rPr>
           <w:b/>
           <w:i w:val="0"/>
         </w:rPr>
-        <w:t>Tài liệu này dành cho nhân viên Miyano</w:t>
-      </w:r>
-      <w:r>
-        <w:rPr>
-          <w:b w:val="0"/>
-          <w:i w:val="0"/>
-        </w:rPr>
-        <w:t xml:space="preserve"> làm việc trên Desk (</w:t>
+        <w:t>Cập nhật 12/10/2026:</w:t>
+      </w:r>
+      <w:r>
+        <w:rPr>
+          <w:b w:val="0"/>
+          <w:i w:val="0"/>
+        </w:rPr>
+        <w:t xml:space="preserve"> cách hiện giá và đặt hàng đã đổi — giá lấy từ Bảng giá của khách, cổng không còn kiểm soát theo hợp đồng/hạn mức, giỏ có hàng chờ báo giá được tách thành hai phiếu. Các đoạn nói khác đi trong tài liệu này đã cũ; xem </w:t>
       </w:r>
       <w:r>
         <w:rPr>
@@ -73,6 +76,39 @@
           <w:color w:val="B03030"/>
           <w:sz w:val="19"/>
         </w:rPr>
+        <w:t>HDSD-gia-theo-bang-gia-va-thoi-gian-giao-hang.md</w:t>
+      </w:r>
+      <w:r>
+        <w:rPr>
+          <w:b w:val="0"/>
+          <w:i w:val="0"/>
+        </w:rPr>
+        <w:t>.</w:t>
+      </w:r>
+    </w:p>
+    <w:p>
+      <w:r>
+        <w:rPr>
+          <w:b/>
+          <w:i w:val="0"/>
+        </w:rPr>
+        <w:t>Tài liệu này dành cho nhân viên Miyano</w:t>
+      </w:r>
+      <w:r>
+        <w:rPr>
+          <w:b w:val="0"/>
+          <w:i w:val="0"/>
+        </w:rPr>
+        <w:t xml:space="preserve"> làm việc trên Desk (</w:t>
+      </w:r>
+      <w:r>
+        <w:rPr>
+          <w:rFonts w:ascii="Consolas" w:hAnsi="Consolas"/>
+          <w:b w:val="0"/>
+          <w:i w:val="0"/>
+          <w:color w:val="B03030"/>
+          <w:sz w:val="19"/>
+        </w:rPr>
         <w:t>/app</w:t>
       </w:r>
       <w:r>
@@ -108,13 +144,41 @@
           <w:b w:val="0"/>
           <w:i w:val="0"/>
         </w:rPr>
-        <w:t xml:space="preserve">, quản lý duyệt ở màn </w:t>
+        <w:t xml:space="preserve">, quản lý duyệt </w:t>
       </w:r>
       <w:r>
         <w:rPr>
           <w:b/>
           <w:i w:val="0"/>
         </w:rPr>
+        <w:t>ngay trên màn chi tiết đơn</w:t>
+      </w:r>
+      <w:r>
+        <w:rPr>
+          <w:b w:val="0"/>
+          <w:i w:val="0"/>
+        </w:rPr>
+        <w:t xml:space="preserve">, cả hai theo dõi ở màn </w:t>
+      </w:r>
+      <w:r>
+        <w:rPr>
+          <w:b/>
+          <w:i w:val="0"/>
+        </w:rPr>
+        <w:t>Danh sách đơn hàng</w:t>
+      </w:r>
+      <w:r>
+        <w:rPr>
+          <w:b w:val="0"/>
+          <w:i w:val="0"/>
+        </w:rPr>
+        <w:t xml:space="preserve"> — xem §4, mục "Thao tác trên màn hình". (Màn </w:t>
+      </w:r>
+      <w:r>
+        <w:rPr>
+          <w:b/>
+          <w:i w:val="0"/>
+        </w:rPr>
         <w:t>Duyệt</w:t>
       </w:r>
       <w:r>
@@ -122,21 +186,21 @@
           <w:b w:val="0"/>
           <w:i w:val="0"/>
         </w:rPr>
-        <w:t xml:space="preserve">, cả hai theo dõi ở màn </w:t>
+        <w:t xml:space="preserve"> riêng đã gỡ 03/09/2026 — hàng chờ nay là chip </w:t>
       </w:r>
       <w:r>
         <w:rPr>
           <w:b/>
           <w:i w:val="0"/>
         </w:rPr>
-        <w:t>Yêu cầu của tôi</w:t>
-      </w:r>
-      <w:r>
-        <w:rPr>
-          <w:b w:val="0"/>
-          <w:i w:val="0"/>
-        </w:rPr>
-        <w:t xml:space="preserve"> — xem §4, mục "Thao tác trên màn hình". Màn quản lý thành viên vẫn chưa làm (§7 mục 2).</w:t>
+        <w:t>Chờ duyệt</w:t>
+      </w:r>
+      <w:r>
+        <w:rPr>
+          <w:b w:val="0"/>
+          <w:i w:val="0"/>
+        </w:rPr>
+        <w:t xml:space="preserve"> của chính danh sách đó.) Màn quản lý thành viên vẫn chưa làm (§7 mục 2).</w:t>
       </w:r>
     </w:p>
     <w:p>
@@ -3257,7 +3321,7 @@
           <w:b/>
           <w:i w:val="0"/>
         </w:rPr>
-        <w:t>Yêu cầu của tôi</w:t>
+        <w:t>Danh sách đơn hàng</w:t>
       </w:r>
       <w:r>
         <w:rPr>
@@ -4549,7 +4613,7 @@
           <w:b/>
           <w:i w:val="0"/>
         </w:rPr>
-        <w:t>Bốn màn của luồng này trên cổng khách:</w:t>
+        <w:t>Hai màn của luồng này trên cổng khách:</w:t>
       </w:r>
     </w:p>
     <w:tbl>
@@ -4723,7 +4787,7 @@
                 <w:b/>
                 <w:i w:val="0"/>
               </w:rPr>
-              <w:t>Yêu cầu của tôi</w:t>
+              <w:t>Danh sách đơn hàng</w:t>
             </w:r>
           </w:p>
         </w:tc>
@@ -4753,7 +4817,7 @@
                 <w:b w:val="0"/>
                 <w:i w:val="0"/>
               </w:rPr>
-              <w:t xml:space="preserve">Danh sách gộp — nhân viên khoa thấy yêu cầu </w:t>
+              <w:t xml:space="preserve">Danh sách gộp — nhân viên khoa thấy đơn </w:t>
             </w:r>
             <w:r>
               <w:rPr>
@@ -4798,54 +4862,35 @@
                 <w:b w:val="0"/>
                 <w:i w:val="0"/>
               </w:rPr>
-              <w:t>)</w:t>
+              <w:t xml:space="preserve">), quản lý lọc thêm được theo </w:t>
             </w:r>
-          </w:p>
-        </w:tc>
-      </w:tr>
-      <w:tr>
-        <w:tc>
-          <w:tcPr>
-            <w:tcW w:type="dxa" w:w="2880"/>
-          </w:tcPr>
-          <w:p>
-            <w:r/>
             <w:r>
               <w:rPr>
                 <w:b/>
                 <w:i w:val="0"/>
               </w:rPr>
-              <w:t>Duyệt</w:t>
+              <w:t>khoa phòng</w:t>
             </w:r>
-          </w:p>
-        </w:tc>
-        <w:tc>
-          <w:tcPr>
-            <w:tcW w:type="dxa" w:w="2880"/>
-          </w:tcPr>
-          <w:p>
-            <w:r/>
+            <w:r>
+              <w:rPr>
+                <w:b w:val="0"/>
+                <w:i w:val="0"/>
+              </w:rPr>
+              <w:t xml:space="preserve">. Chip </w:t>
+            </w:r>
             <w:r>
               <w:rPr>
                 <w:b/>
                 <w:i w:val="0"/>
               </w:rPr>
-              <w:t>chỉ quản lý</w:t>
+              <w:t>Chờ duyệt</w:t>
             </w:r>
-          </w:p>
-        </w:tc>
-        <w:tc>
-          <w:tcPr>
-            <w:tcW w:type="dxa" w:w="2880"/>
-          </w:tcPr>
-          <w:p>
-            <w:r/>
             <w:r>
               <w:rPr>
                 <w:b w:val="0"/>
                 <w:i w:val="0"/>
               </w:rPr>
-              <w:t xml:space="preserve">Hàng chờ: gộp </w:t>
+              <w:t xml:space="preserve"> CHÍNH LÀ hàng chờ của quản lý (gộp </w:t>
             </w:r>
             <w:r>
               <w:rPr>
@@ -4879,54 +4924,14 @@
                 <w:b w:val="0"/>
                 <w:i w:val="0"/>
               </w:rPr>
-              <w:t>, lọc theo khoa phòng. Con số trên mục menu là số yêu cầu đang chờ</w:t>
+              <w:t xml:space="preserve">); con số đỏ trên mục menu là số đơn đang chờ, </w:t>
             </w:r>
-          </w:p>
-        </w:tc>
-      </w:tr>
-      <w:tr>
-        <w:tc>
-          <w:tcPr>
-            <w:tcW w:type="dxa" w:w="2880"/>
-          </w:tcPr>
-          <w:p>
-            <w:r/>
             <w:r>
               <w:rPr>
                 <w:b/>
                 <w:i w:val="0"/>
               </w:rPr>
-              <w:t>Chi tiết yêu cầu</w:t>
-            </w:r>
-          </w:p>
-        </w:tc>
-        <w:tc>
-          <w:tcPr>
-            <w:tcW w:type="dxa" w:w="2880"/>
-          </w:tcPr>
-          <w:p>
-            <w:r/>
-            <w:r>
-              <w:rPr>
-                <w:b w:val="0"/>
-                <w:i w:val="0"/>
-              </w:rPr>
-              <w:t>ai mở được yêu cầu đó</w:t>
-            </w:r>
-          </w:p>
-        </w:tc>
-        <w:tc>
-          <w:tcPr>
-            <w:tcW w:type="dxa" w:w="2880"/>
-          </w:tcPr>
-          <w:p>
-            <w:r/>
-            <w:r>
-              <w:rPr>
-                <w:b w:val="0"/>
-                <w:i w:val="0"/>
-              </w:rPr>
-              <w:t>Đầu phiếu (truy vết), bảng dòng hàng kèm nhãn giá từng dòng, và thanh nút hành động theo trạng thái + vai trò</w:t>
+              <w:t>chỉ quản lý thấy</w:t>
             </w:r>
           </w:p>
         </w:tc>
@@ -4936,73 +4941,114 @@
     <w:p>
       <w:r>
         <w:rPr>
+          <w:b w:val="0"/>
+          <w:i w:val="0"/>
+        </w:rPr>
+        <w:t xml:space="preserve">Bấm vào một dòng ở danh sách mở ra </w:t>
+      </w:r>
+      <w:r>
+        <w:rPr>
           <w:b/>
           <w:i w:val="0"/>
         </w:rPr>
-        <w:t>Toàn bộ menu của khách nay còn 8 mục</w:t>
-      </w:r>
-      <w:r>
-        <w:rPr>
-          <w:b w:val="0"/>
-          <w:i w:val="0"/>
-        </w:rPr>
-        <w:t xml:space="preserve"> (7 với nhân viên khoa — họ không có mục </w:t>
-      </w:r>
-      <w:r>
-        <w:rPr>
-          <w:b w:val="0"/>
-          <w:i/>
-        </w:rPr>
-        <w:t>Duyệt</w:t>
-      </w:r>
-      <w:r>
-        <w:rPr>
-          <w:b w:val="0"/>
-          <w:i w:val="0"/>
-        </w:rPr>
-        <w:t xml:space="preserve">): Tổng quan · Đặt hàng · Yêu cầu của tôi · Duyệt · Kho của tôi · Hoá đơn &amp; công nợ · Thông báo · Hồ sơ đơn vị. Ba mục cũ </w:t>
-      </w:r>
-      <w:r>
-        <w:rPr>
-          <w:b w:val="0"/>
-          <w:i/>
-        </w:rPr>
-        <w:t>Giỏ hàng</w:t>
-      </w:r>
-      <w:r>
-        <w:rPr>
-          <w:b w:val="0"/>
-          <w:i w:val="0"/>
-        </w:rPr>
-        <w:t xml:space="preserve">, </w:t>
-      </w:r>
-      <w:r>
-        <w:rPr>
-          <w:b w:val="0"/>
-          <w:i/>
-        </w:rPr>
-        <w:t>Đơn hàng của tôi</w:t>
-      </w:r>
-      <w:r>
-        <w:rPr>
-          <w:b w:val="0"/>
-          <w:i w:val="0"/>
-        </w:rPr>
-        <w:t xml:space="preserve">, </w:t>
-      </w:r>
-      <w:r>
-        <w:rPr>
-          <w:b w:val="0"/>
-          <w:i/>
-        </w:rPr>
-        <w:t>Đề xuất mua</w:t>
-      </w:r>
-      <w:r>
-        <w:rPr>
-          <w:b w:val="0"/>
-          <w:i w:val="0"/>
-        </w:rPr>
-        <w:t xml:space="preserve"> đã biến mất; đường dẫn cũ của chúng tự chuyển sang màn mới nên link trong thông báo đã gửi đi và bookmark của khách vẫn dùng được.</w:t>
+        <w:t>Chi tiết đơn hàng</w:t>
+      </w:r>
+      <w:r>
+        <w:rPr>
+          <w:b w:val="0"/>
+          <w:i w:val="0"/>
+        </w:rPr>
+        <w:t xml:space="preserve"> — từ 03/09/2026 đây là </w:t>
+      </w:r>
+      <w:r>
+        <w:rPr>
+          <w:b/>
+          <w:i w:val="0"/>
+        </w:rPr>
+        <w:t>một</w:t>
+      </w:r>
+      <w:r>
+        <w:rPr>
+          <w:b w:val="0"/>
+          <w:i w:val="0"/>
+        </w:rPr>
+        <w:t xml:space="preserve"> màn duy nhất cho cả phiếu đề xuất lẫn đơn hàng sinh ra từ nó (trước đó là hai màn rời, phải bấm thêm một link mới sang được đơn). Khối nào không có dữ liệu thì không hiện, đọc từ trên xuống theo dòng thời gian của yêu cầu: đầu trang (mã, giai đoạn, khoa phòng, ngày) → banner </w:t>
+      </w:r>
+      <w:r>
+        <w:rPr>
+          <w:b/>
+          <w:i w:val="0"/>
+        </w:rPr>
+        <w:t>"Việc đang chờ bạn"</w:t>
+      </w:r>
+      <w:r>
+        <w:rPr>
+          <w:b w:val="0"/>
+          <w:i w:val="0"/>
+        </w:rPr>
+        <w:t xml:space="preserve"> cùng toàn bộ nút hành động gộp một chỗ → thanh tiến trình (chỉ khi đã có đơn) → khối </w:t>
+      </w:r>
+      <w:r>
+        <w:rPr>
+          <w:b/>
+          <w:i w:val="0"/>
+        </w:rPr>
+        <w:t>Yêu cầu &amp; duyệt</w:t>
+      </w:r>
+      <w:r>
+        <w:rPr>
+          <w:b w:val="0"/>
+          <w:i w:val="0"/>
+        </w:rPr>
+        <w:t xml:space="preserve"> (người yêu cầu, thời điểm gửi, lý do, người duyệt, thời điểm duyệt, tư cách duyệt — thu gọn được, và </w:t>
+      </w:r>
+      <w:r>
+        <w:rPr>
+          <w:b/>
+          <w:i w:val="0"/>
+        </w:rPr>
+        <w:t>tự thu gọn khi đơn đã giao xong</w:t>
+      </w:r>
+      <w:r>
+        <w:rPr>
+          <w:b w:val="0"/>
+          <w:i w:val="0"/>
+        </w:rPr>
+        <w:t xml:space="preserve">) → một bảng mặt hàng duy nhất, cột SL duyệt/SL đặt/Đơn giá/Đã giao mọc thêm theo giai đoạn đơn đã tới → giao hàng, hoá đơn và tài liệu của đơn đó. Đường dẫn cũ </w:t>
+      </w:r>
+      <w:r>
+        <w:rPr>
+          <w:rFonts w:ascii="Consolas" w:hAnsi="Consolas"/>
+          <w:b w:val="0"/>
+          <w:i w:val="0"/>
+          <w:color w:val="B03030"/>
+          <w:sz w:val="19"/>
+        </w:rPr>
+        <w:t>/orders/:name</w:t>
+      </w:r>
+      <w:r>
+        <w:rPr>
+          <w:b w:val="0"/>
+          <w:i w:val="0"/>
+        </w:rPr>
+        <w:t xml:space="preserve"> và </w:t>
+      </w:r>
+      <w:r>
+        <w:rPr>
+          <w:rFonts w:ascii="Consolas" w:hAnsi="Consolas"/>
+          <w:b w:val="0"/>
+          <w:i w:val="0"/>
+          <w:color w:val="B03030"/>
+          <w:sz w:val="19"/>
+        </w:rPr>
+        <w:t>/de-xuat/:ten</w:t>
+      </w:r>
+      <w:r>
+        <w:rPr>
+          <w:b w:val="0"/>
+          <w:i w:val="0"/>
+        </w:rPr>
+        <w:t xml:space="preserve"> vẫn chuyển hướng đúng, không đổi bookmark hay link trong thông báo đã gửi.</w:t>
       </w:r>
     </w:p>
     <w:p>
@@ -5011,7 +5057,131 @@
           <w:b/>
           <w:i w:val="0"/>
         </w:rPr>
-        <w:t>Quản lý sửa số lượng rồi duyệt — thao tác chính, làm ở màn chi tiết:</w:t>
+        <w:t>Toàn bộ menu của khách nay còn 7 mục, giống nhau cho mọi vai trò</w:t>
+      </w:r>
+      <w:r>
+        <w:rPr>
+          <w:b w:val="0"/>
+          <w:i w:val="0"/>
+        </w:rPr>
+        <w:t xml:space="preserve">: Tổng quan · Đặt hàng · Danh sách đơn hàng · Kho của tôi · Hoá đơn &amp; công nợ · Thông báo · Hồ sơ đơn vị. Bốn mục cũ </w:t>
+      </w:r>
+      <w:r>
+        <w:rPr>
+          <w:b w:val="0"/>
+          <w:i/>
+        </w:rPr>
+        <w:t>Giỏ hàng</w:t>
+      </w:r>
+      <w:r>
+        <w:rPr>
+          <w:b w:val="0"/>
+          <w:i w:val="0"/>
+        </w:rPr>
+        <w:t xml:space="preserve">, </w:t>
+      </w:r>
+      <w:r>
+        <w:rPr>
+          <w:b w:val="0"/>
+          <w:i/>
+        </w:rPr>
+        <w:t>Đơn hàng của tôi</w:t>
+      </w:r>
+      <w:r>
+        <w:rPr>
+          <w:b w:val="0"/>
+          <w:i w:val="0"/>
+        </w:rPr>
+        <w:t xml:space="preserve">, </w:t>
+      </w:r>
+      <w:r>
+        <w:rPr>
+          <w:b w:val="0"/>
+          <w:i/>
+        </w:rPr>
+        <w:t>Đề xuất mua</w:t>
+      </w:r>
+      <w:r>
+        <w:rPr>
+          <w:b w:val="0"/>
+          <w:i w:val="0"/>
+        </w:rPr>
+        <w:t xml:space="preserve">, </w:t>
+      </w:r>
+      <w:r>
+        <w:rPr>
+          <w:b w:val="0"/>
+          <w:i/>
+        </w:rPr>
+        <w:t>Duyệt</w:t>
+      </w:r>
+      <w:r>
+        <w:rPr>
+          <w:b w:val="0"/>
+          <w:i w:val="0"/>
+        </w:rPr>
+        <w:t xml:space="preserve"> đã biến mất; đường dẫn cũ của chúng tự chuyển sang màn mới nên link trong thông báo đã gửi đi và bookmark của khách vẫn dùng được (</w:t>
+      </w:r>
+      <w:r>
+        <w:rPr>
+          <w:rFonts w:ascii="Consolas" w:hAnsi="Consolas"/>
+          <w:b w:val="0"/>
+          <w:i w:val="0"/>
+          <w:color w:val="B03030"/>
+          <w:sz w:val="19"/>
+        </w:rPr>
+        <w:t>/duyet</w:t>
+      </w:r>
+      <w:r>
+        <w:rPr>
+          <w:b w:val="0"/>
+          <w:i w:val="0"/>
+        </w:rPr>
+        <w:t xml:space="preserve"> chuyển sang danh sách đơn hàng đã lọc sẵn chip </w:t>
+      </w:r>
+      <w:r>
+        <w:rPr>
+          <w:b/>
+          <w:i w:val="0"/>
+        </w:rPr>
+        <w:t>Chờ duyệt</w:t>
+      </w:r>
+      <w:r>
+        <w:rPr>
+          <w:b w:val="0"/>
+          <w:i w:val="0"/>
+        </w:rPr>
+        <w:t>).</w:t>
+      </w:r>
+    </w:p>
+    <w:p>
+      <w:r>
+        <w:rPr>
+          <w:b/>
+          <w:i w:val="0"/>
+        </w:rPr>
+        <w:t>Quản lý sửa số lượng rồi duyệt — thao tác chính, làm ở màn chi tiết.</w:t>
+      </w:r>
+      <w:r>
+        <w:rPr>
+          <w:b w:val="0"/>
+          <w:i w:val="0"/>
+        </w:rPr>
+        <w:t xml:space="preserve"> Từ 03/09/2026 bảng </w:t>
+      </w:r>
+      <w:r>
+        <w:rPr>
+          <w:b/>
+          <w:i w:val="0"/>
+        </w:rPr>
+        <w:t>SL duyệt</w:t>
+      </w:r>
+      <w:r>
+        <w:rPr>
+          <w:b w:val="0"/>
+          <w:i w:val="0"/>
+        </w:rPr>
+        <w:t xml:space="preserve"> nằm ngay trên cùng một màn với thanh tiến trình và khối giao hàng — không phải bấm sang trang khác mới thấy đơn đã tới đâu sau khi duyệt:</w:t>
       </w:r>
     </w:p>
     <w:p>
@@ -5030,14 +5200,28 @@
           <w:b/>
           <w:i w:val="0"/>
         </w:rPr>
-        <w:t>Duyệt</w:t>
-      </w:r>
-      <w:r>
-        <w:rPr>
-          <w:b w:val="0"/>
-          <w:i w:val="0"/>
-        </w:rPr>
-        <w:t xml:space="preserve"> → chọn khoa nếu muốn → bấm vào phiếu.</w:t>
+        <w:t>Danh sách đơn hàng</w:t>
+      </w:r>
+      <w:r>
+        <w:rPr>
+          <w:b w:val="0"/>
+          <w:i w:val="0"/>
+        </w:rPr>
+        <w:t xml:space="preserve"> → chip </w:t>
+      </w:r>
+      <w:r>
+        <w:rPr>
+          <w:b/>
+          <w:i w:val="0"/>
+        </w:rPr>
+        <w:t>Chờ duyệt</w:t>
+      </w:r>
+      <w:r>
+        <w:rPr>
+          <w:b w:val="0"/>
+          <w:i w:val="0"/>
+        </w:rPr>
+        <w:t xml:space="preserve"> → chọn khoa nếu muốn → bấm vào đơn.</w:t>
       </w:r>
     </w:p>
     <w:p>
@@ -5318,7 +5502,269 @@
           <w:b w:val="0"/>
           <w:i w:val="0"/>
         </w:rPr>
-        <w:t xml:space="preserve"> đưa về đúng danh sách đã tới, giữ nguyên bộ lọc khoa (hoặc chip trạng thái) đang mở — duyệt liên tiếp nhiều phiếu của một khoa không phải chọn lại bộ lọc sau mỗi phiếu.</w:t>
+        <w:t xml:space="preserve"> đưa về đúng danh sách đã tới, giữ nguyên bộ lọc khoa </w:t>
+      </w:r>
+      <w:r>
+        <w:rPr>
+          <w:b/>
+          <w:i w:val="0"/>
+        </w:rPr>
+        <w:t>và</w:t>
+      </w:r>
+      <w:r>
+        <w:rPr>
+          <w:b w:val="0"/>
+          <w:i w:val="0"/>
+        </w:rPr>
+        <w:t xml:space="preserve"> chip trạng thái đang mở — duyệt liên tiếp nhiều phiếu của một khoa không phải chọn lại bộ lọc sau mỗi phiếu.</w:t>
+      </w:r>
+    </w:p>
+    <w:p>
+      <w:pPr>
+        <w:pStyle w:val="Heading3"/>
+      </w:pPr>
+      <w:r>
+        <w:t>Nhân viên khoa sửa đơn đang "Chờ duyệt"</w:t>
+      </w:r>
+    </w:p>
+    <w:p>
+      <w:r>
+        <w:rPr>
+          <w:b w:val="0"/>
+          <w:i w:val="0"/>
+        </w:rPr>
+        <w:t xml:space="preserve">Gõ nhầm số rồi mới bấm Gửi duyệt là chuyện thường. Từ 03/09/2026, </w:t>
+      </w:r>
+      <w:r>
+        <w:rPr>
+          <w:b/>
+          <w:i w:val="0"/>
+        </w:rPr>
+        <w:t>chủ đơn</w:t>
+      </w:r>
+      <w:r>
+        <w:rPr>
+          <w:b w:val="0"/>
+          <w:i w:val="0"/>
+        </w:rPr>
+        <w:t xml:space="preserve"> (đúng người đã lập) mở đơn ở trạng thái </w:t>
+      </w:r>
+      <w:r>
+        <w:rPr>
+          <w:b/>
+          <w:i w:val="0"/>
+        </w:rPr>
+        <w:t>Chờ duyệt</w:t>
+      </w:r>
+      <w:r>
+        <w:rPr>
+          <w:b w:val="0"/>
+          <w:i w:val="0"/>
+        </w:rPr>
+        <w:t xml:space="preserve"> sẽ thấy nút </w:t>
+      </w:r>
+      <w:r>
+        <w:rPr>
+          <w:b/>
+          <w:i w:val="0"/>
+        </w:rPr>
+        <w:t>Thu hồi để sửa</w:t>
+      </w:r>
+      <w:r>
+        <w:rPr>
+          <w:b w:val="0"/>
+          <w:i w:val="0"/>
+        </w:rPr>
+        <w:t>:</w:t>
+      </w:r>
+    </w:p>
+    <w:p>
+      <w:pPr>
+        <w:pStyle w:val="ListNumber"/>
+      </w:pPr>
+      <w:r>
+        <w:rPr>
+          <w:b w:val="0"/>
+          <w:i w:val="0"/>
+        </w:rPr>
+        <w:t xml:space="preserve">Bấm nút → hộp xác nhận nói rõ đơn sẽ </w:t>
+      </w:r>
+      <w:r>
+        <w:rPr>
+          <w:b/>
+          <w:i w:val="0"/>
+        </w:rPr>
+        <w:t>về Nháp</w:t>
+      </w:r>
+      <w:r>
+        <w:rPr>
+          <w:b w:val="0"/>
+          <w:i w:val="0"/>
+        </w:rPr>
+        <w:t xml:space="preserve"> và </w:t>
+      </w:r>
+      <w:r>
+        <w:rPr>
+          <w:b/>
+          <w:i w:val="0"/>
+        </w:rPr>
+        <w:t>rời hàng chờ của quản lý</w:t>
+      </w:r>
+      <w:r>
+        <w:rPr>
+          <w:b w:val="0"/>
+          <w:i w:val="0"/>
+        </w:rPr>
+        <w:t>.</w:t>
+      </w:r>
+    </w:p>
+    <w:p>
+      <w:pPr>
+        <w:pStyle w:val="ListNumber"/>
+      </w:pPr>
+      <w:r>
+        <w:rPr>
+          <w:b w:val="0"/>
+          <w:i w:val="0"/>
+        </w:rPr>
+        <w:t xml:space="preserve">Hệ thống đưa thẳng sang màn </w:t>
+      </w:r>
+      <w:r>
+        <w:rPr>
+          <w:b/>
+          <w:i w:val="0"/>
+        </w:rPr>
+        <w:t>Đặt hàng</w:t>
+      </w:r>
+      <w:r>
+        <w:rPr>
+          <w:b w:val="0"/>
+          <w:i w:val="0"/>
+        </w:rPr>
+        <w:t xml:space="preserve"> với đúng đơn đó, sửa thoải mái.</w:t>
+      </w:r>
+    </w:p>
+    <w:p>
+      <w:pPr>
+        <w:pStyle w:val="ListNumber"/>
+      </w:pPr>
+      <w:r>
+        <w:rPr>
+          <w:b w:val="0"/>
+          <w:i w:val="0"/>
+        </w:rPr>
+        <w:t xml:space="preserve">Sửa xong bấm </w:t>
+      </w:r>
+      <w:r>
+        <w:rPr>
+          <w:b/>
+          <w:i w:val="0"/>
+        </w:rPr>
+        <w:t>Gửi duyệt</w:t>
+      </w:r>
+      <w:r>
+        <w:rPr>
+          <w:b w:val="0"/>
+          <w:i w:val="0"/>
+        </w:rPr>
+        <w:t xml:space="preserve"> lại. </w:t>
+      </w:r>
+      <w:r>
+        <w:rPr>
+          <w:b/>
+          <w:i w:val="0"/>
+        </w:rPr>
+        <w:t>Mã đơn giữ nguyên</w:t>
+      </w:r>
+      <w:r>
+        <w:rPr>
+          <w:b w:val="0"/>
+          <w:i w:val="0"/>
+        </w:rPr>
+        <w:t xml:space="preserve"> — quản lý và khoa vẫn gọi tên nó bằng đúng mã cũ.</w:t>
+      </w:r>
+    </w:p>
+    <w:p>
+      <w:r>
+        <w:rPr>
+          <w:b w:val="0"/>
+          <w:i w:val="0"/>
+        </w:rPr>
+        <w:t xml:space="preserve">Vì sao phải đi vòng qua Nháp thay vì sửa tại chỗ: cột </w:t>
+      </w:r>
+      <w:r>
+        <w:rPr>
+          <w:b/>
+          <w:i w:val="0"/>
+        </w:rPr>
+        <w:t>Số lượng đề xuất</w:t>
+      </w:r>
+      <w:r>
+        <w:rPr>
+          <w:b w:val="0"/>
+          <w:i w:val="0"/>
+        </w:rPr>
+        <w:t xml:space="preserve"> khoá vĩnh viễn từ lúc Gửi duyệt (đó là cách hệ thống trả lời "khoa xin gì / duyệt gì"). Thu hồi là cách mở khoá đó mà không phá phép so sánh ấy.</w:t>
+      </w:r>
+    </w:p>
+    <w:p>
+      <w:r>
+        <w:rPr>
+          <w:b/>
+          <w:i w:val="0"/>
+        </w:rPr>
+        <w:t>Ai KHÔNG có nút này:</w:t>
+      </w:r>
+      <w:r>
+        <w:rPr>
+          <w:b w:val="0"/>
+          <w:i w:val="0"/>
+        </w:rPr>
+        <w:t xml:space="preserve"> đồng nghiệp cùng khoa, và quản lý (trên đơn của người khác). Quản lý muốn trả đơn về cho khoa thì dùng </w:t>
+      </w:r>
+      <w:r>
+        <w:rPr>
+          <w:b/>
+          <w:i w:val="0"/>
+        </w:rPr>
+        <w:t>Từ chối</w:t>
+      </w:r>
+      <w:r>
+        <w:rPr>
+          <w:b w:val="0"/>
+          <w:i w:val="0"/>
+        </w:rPr>
+        <w:t xml:space="preserve"> — bắt buộc ghi lý do, để khoa biết vì sao. Quản lý cũng không cần nút này: họ sửa số lượng thẳng ở cột </w:t>
+      </w:r>
+      <w:r>
+        <w:rPr>
+          <w:b/>
+          <w:i w:val="0"/>
+        </w:rPr>
+        <w:t>SL duyệt</w:t>
+      </w:r>
+      <w:r>
+        <w:rPr>
+          <w:b w:val="0"/>
+          <w:i w:val="0"/>
+        </w:rPr>
+        <w:t xml:space="preserve"> ngay trên màn chi tiết.</w:t>
+      </w:r>
+    </w:p>
+    <w:p>
+      <w:r>
+        <w:rPr>
+          <w:b/>
+          <w:i w:val="0"/>
+        </w:rPr>
+        <w:t>Quản lý đang mở đúng đơn vừa bị thu hồi</w:t>
+      </w:r>
+      <w:r>
+        <w:rPr>
+          <w:b w:val="0"/>
+          <w:i w:val="0"/>
+        </w:rPr>
+        <w:t xml:space="preserve"> rồi bấm Duyệt sẽ nhận báo lỗi "không chuyển được phiếu từ Nháp sang Đã duyệt" — đơn đã rời hàng chờ, không có gì bị duyệt nhầm.</w:t>
       </w:r>
     </w:p>
     <w:p>
@@ -6817,7 +7263,7 @@
           <w:b w:val="0"/>
           <w:i w:val="0"/>
         </w:rPr>
-        <w:t xml:space="preserve"> Quản lý đi vắng thì chưa có ai duyệt thay — thuộc kế hoạch C. 3b. </w:t>
+        <w:t xml:space="preserve"> Quản lý đi vắng thì chưa có ai duyệt thay — thuộc kế hoạch C. 3b. ~~</w:t>
       </w:r>
       <w:r>
         <w:rPr>
@@ -6831,7 +7277,83 @@
           <w:b w:val="0"/>
           <w:i w:val="0"/>
         </w:rPr>
-        <w:t xml:space="preserve"> Khi quản lý duyệt một yêu cầu sửa số lượng, phiếu không ghi thêm người duyệt và thời điểm cho vòng đó — khối truy vết vẫn chỉ mang dấu của lần duyệt đầu.</w:t>
+        <w:t xml:space="preserve">~~ </w:t>
+      </w:r>
+      <w:r>
+        <w:rPr>
+          <w:b/>
+          <w:i w:val="0"/>
+        </w:rPr>
+        <w:t>ĐÃ VÁ 03/09/2026.</w:t>
+      </w:r>
+      <w:r>
+        <w:rPr>
+          <w:b w:val="0"/>
+          <w:i w:val="0"/>
+        </w:rPr>
+        <w:t xml:space="preserve"> Trước đó, khi quản lý duyệt một yêu cầu sửa số lượng, phiếu không ghi thêm người duyệt và thời điểm cho vòng đó — khối truy vết vẫn chỉ mang dấu của lần duyệt đầu. Nay </w:t>
+      </w:r>
+      <w:r>
+        <w:rPr>
+          <w:b/>
+          <w:i w:val="0"/>
+        </w:rPr>
+        <w:t>sổ nhật ký thao tác</w:t>
+      </w:r>
+      <w:r>
+        <w:rPr>
+          <w:b w:val="0"/>
+          <w:i w:val="0"/>
+        </w:rPr>
+        <w:t xml:space="preserve"> (§4b) ghi một dòng riêng cho mỗi vòng xin sửa / đồng ý sửa / không đồng ý sửa, kèm người và mốc giờ. Bốn trường trên phiếu (</w:t>
+      </w:r>
+      <w:r>
+        <w:rPr>
+          <w:rFonts w:ascii="Consolas" w:hAnsi="Consolas"/>
+          <w:b w:val="0"/>
+          <w:i w:val="0"/>
+          <w:color w:val="B03030"/>
+          <w:sz w:val="19"/>
+        </w:rPr>
+        <w:t>nguoi_duyet</w:t>
+      </w:r>
+      <w:r>
+        <w:rPr>
+          <w:b w:val="0"/>
+          <w:i w:val="0"/>
+        </w:rPr>
+        <w:t xml:space="preserve">, </w:t>
+      </w:r>
+      <w:r>
+        <w:rPr>
+          <w:rFonts w:ascii="Consolas" w:hAnsi="Consolas"/>
+          <w:b w:val="0"/>
+          <w:i w:val="0"/>
+          <w:color w:val="B03030"/>
+          <w:sz w:val="19"/>
+        </w:rPr>
+        <w:t>thoi_diem_duyet</w:t>
+      </w:r>
+      <w:r>
+        <w:rPr>
+          <w:b w:val="0"/>
+          <w:i w:val="0"/>
+        </w:rPr>
+        <w:t xml:space="preserve">, ...) vẫn </w:t>
+      </w:r>
+      <w:r>
+        <w:rPr>
+          <w:b/>
+          <w:i w:val="0"/>
+        </w:rPr>
+        <w:t>giữ nguyên</w:t>
+      </w:r>
+      <w:r>
+        <w:rPr>
+          <w:b w:val="0"/>
+          <w:i w:val="0"/>
+        </w:rPr>
+        <w:t xml:space="preserve"> dấu của lần duyệt đầu — cố ý, vì chúng là dữ liệu chứng từ, còn sổ mới là nơi kể chuyện nhiều vòng.</w:t>
       </w:r>
     </w:p>
     <w:p>

</xml_diff>